<commit_message>
feat: update competition paper and fix dashboard
</commit_message>
<xml_diff>
--- a/论文/第41届浦东新区青少年科技创新大赛申报表-2(青少年科学论文).docx
+++ b/论文/第41届浦东新区青少年科技创新大赛申报表-2(青少年科学论文).docx
@@ -31,20 +31,6 @@
           <w:sz w:val="36"/>
         </w:rPr>
         <w:t>届浦东新区青少年科技创新大赛申报表</w:t>
-      </w:r>
-      <w:r>
-        <w:rPr>
-          <w:rFonts w:eastAsia="黑体"/>
-          <w:sz w:val="36"/>
-        </w:rPr>
-        <w:t xml:space="preserve"> </w:t>
-      </w:r>
-      <w:r>
-        <w:rPr>
-          <w:rFonts w:eastAsia="黑体" w:hint="eastAsia"/>
-          <w:sz w:val="36"/>
-        </w:rPr>
-        <w:t>(2)</w:t>
       </w:r>
     </w:p>
     <w:p>
@@ -87,7 +73,7 @@
         <w:spacing w:afterLines="20" w:after="72" w:line="280" w:lineRule="exact"/>
         <w:jc w:val="right"/>
         <w:rPr>
-          <w:rFonts w:eastAsia="黑体" w:hint="eastAsia"/>
+          <w:rFonts w:eastAsia="黑体"/>
           <w:sz w:val="28"/>
         </w:rPr>
       </w:pPr>
@@ -96,23 +82,7 @@
           <w:rFonts w:eastAsia="黑体" w:hint="eastAsia"/>
           <w:sz w:val="28"/>
         </w:rPr>
-        <w:t>申报</w:t>
-      </w:r>
-      <w:proofErr w:type="gramStart"/>
-      <w:r>
-        <w:rPr>
-          <w:rFonts w:eastAsia="黑体" w:hint="eastAsia"/>
-          <w:sz w:val="28"/>
-        </w:rPr>
-        <w:t>帐号</w:t>
-      </w:r>
-      <w:proofErr w:type="gramEnd"/>
-      <w:r>
-        <w:rPr>
-          <w:rFonts w:eastAsia="黑体" w:hint="eastAsia"/>
-          <w:sz w:val="28"/>
-        </w:rPr>
-        <w:t>：</w:t>
+        <w:t>申报帐号：</w:t>
       </w:r>
       <w:r>
         <w:rPr>
@@ -3024,6 +2994,14 @@
                 <w:szCs w:val="24"/>
               </w:rPr>
             </w:pPr>
+            <w:r>
+              <w:rPr>
+                <w:rFonts w:ascii="仿宋" w:eastAsia="仿宋" w:hAnsi="仿宋" w:hint="eastAsia"/>
+                <w:sz w:val="24"/>
+                <w:szCs w:val="24"/>
+              </w:rPr>
+              <w:t>姜徐宁</w:t>
+            </w:r>
           </w:p>
         </w:tc>
         <w:tc>
@@ -3041,6 +3019,14 @@
                 <w:szCs w:val="24"/>
               </w:rPr>
             </w:pPr>
+            <w:r>
+              <w:rPr>
+                <w:rFonts w:ascii="仿宋" w:eastAsia="仿宋" w:hAnsi="仿宋" w:hint="eastAsia"/>
+                <w:sz w:val="24"/>
+                <w:szCs w:val="24"/>
+              </w:rPr>
+              <w:t>女</w:t>
+            </w:r>
           </w:p>
         </w:tc>
         <w:tc>
@@ -3059,6 +3045,14 @@
                 <w:szCs w:val="24"/>
               </w:rPr>
             </w:pPr>
+            <w:r>
+              <w:rPr>
+                <w:rFonts w:ascii="仿宋" w:eastAsia="仿宋" w:hAnsi="仿宋" w:hint="eastAsia"/>
+                <w:sz w:val="24"/>
+                <w:szCs w:val="24"/>
+              </w:rPr>
+              <w:t>高藤致远创新学校</w:t>
+            </w:r>
           </w:p>
         </w:tc>
         <w:tc>
@@ -3076,6 +3070,14 @@
                 <w:szCs w:val="24"/>
               </w:rPr>
             </w:pPr>
+            <w:r>
+              <w:rPr>
+                <w:rFonts w:ascii="仿宋" w:eastAsia="仿宋" w:hAnsi="仿宋" w:hint="eastAsia"/>
+                <w:sz w:val="24"/>
+                <w:szCs w:val="24"/>
+              </w:rPr>
+              <w:t>13676700820</w:t>
+            </w:r>
           </w:p>
         </w:tc>
       </w:tr>
@@ -3398,61 +3400,7 @@
                 <w:sz w:val="24"/>
                 <w:szCs w:val="24"/>
               </w:rPr>
-              <w:t>本作品以连续时间动力系统统一刻画神经网络训练，结合自适应与</w:t>
-            </w:r>
-            <w:proofErr w:type="gramStart"/>
-            <w:r>
-              <w:rPr>
-                <w:rFonts w:ascii="仿宋" w:eastAsia="仿宋" w:hAnsi="仿宋"/>
-                <w:sz w:val="24"/>
-                <w:szCs w:val="24"/>
-              </w:rPr>
-              <w:t>保结构</w:t>
-            </w:r>
-            <w:proofErr w:type="gramEnd"/>
-            <w:r>
-              <w:rPr>
-                <w:rFonts w:ascii="仿宋" w:eastAsia="仿宋" w:hAnsi="仿宋"/>
-                <w:sz w:val="24"/>
-                <w:szCs w:val="24"/>
-              </w:rPr>
-              <w:t>数值方法，构建RK4、DOPRI54、IMEX与辛积分等优化器体系；配套数字/模拟/混合能耗模型与硬件仿真，系统评估准确率、函数评估次数与能耗。工程方面，在MNIST子集、正弦回归与刚性问题上开展对比：DOPRI54体现更优能效—精度权衡，辛积分在长期训练中能量</w:t>
-            </w:r>
-            <w:proofErr w:type="gramStart"/>
-            <w:r>
-              <w:rPr>
-                <w:rFonts w:ascii="仿宋" w:eastAsia="仿宋" w:hAnsi="仿宋"/>
-                <w:sz w:val="24"/>
-                <w:szCs w:val="24"/>
-              </w:rPr>
-              <w:t>漂移低</w:t>
-            </w:r>
-            <w:proofErr w:type="gramEnd"/>
-            <w:r>
-              <w:rPr>
-                <w:rFonts w:ascii="仿宋" w:eastAsia="仿宋" w:hAnsi="仿宋"/>
-                <w:sz w:val="24"/>
-                <w:szCs w:val="24"/>
-              </w:rPr>
-              <w:t>且稳定性好，IMEX在刚性场景允许更大有效步长并抑制发散。教育方面，设计“能耗意识+连续时间”的教学任务、评测量表与可视化</w:t>
-            </w:r>
-            <w:proofErr w:type="gramStart"/>
-            <w:r>
-              <w:rPr>
-                <w:rFonts w:ascii="仿宋" w:eastAsia="仿宋" w:hAnsi="仿宋"/>
-                <w:sz w:val="24"/>
-                <w:szCs w:val="24"/>
-              </w:rPr>
-              <w:t>—报告</w:t>
-            </w:r>
-            <w:proofErr w:type="gramEnd"/>
-            <w:r>
-              <w:rPr>
-                <w:rFonts w:ascii="仿宋" w:eastAsia="仿宋" w:hAnsi="仿宋"/>
-                <w:sz w:val="24"/>
-                <w:szCs w:val="24"/>
-              </w:rPr>
-              <w:t>流程，验证其对学习成效、复现实验与工程素养的提升。作品提供可复现的数据—图表—PDF产线，便于审查、推广与二次开发。</w:t>
+              <w:t>本作品以连续时间动力系统统一刻画神经网络训练，结合自适应与保结构数值方法，构建RK4、DOPRI54、IMEX与辛积分等优化器体系；配套数字/模拟/混合能耗模型与硬件仿真，系统评估准确率、函数评估次数与能耗。工程方面，在MNIST子集、正弦回归与刚性问题上开展对比：DOPRI54体现更优能效—精度权衡，辛积分在长期训练中能量漂移低且稳定性好，IMEX在刚性场景允许更大有效步长并抑制发散。教育方面，设计“能耗意识+连续时间”的教学任务、评测量表与可视化—报告流程，验证其对学习成效、复现实验与工程素养的提升。作品提供可复现的数据—图表—PDF产线，便于审查、推广与二次开发。</w:t>
             </w:r>
           </w:p>
           <w:p>
@@ -3584,25 +3532,7 @@
                 <w:sz w:val="21"/>
                 <w:szCs w:val="21"/>
               </w:rPr>
-              <w:t>项目基于连续时间动力系统提出一体化“模拟计算启发训练”框架，围绕能效、稳定性与可复现性</w:t>
-            </w:r>
-            <w:proofErr w:type="gramStart"/>
-            <w:r>
-              <w:rPr>
-                <w:rFonts w:ascii="仿宋" w:eastAsia="仿宋" w:hAnsi="仿宋"/>
-                <w:sz w:val="21"/>
-                <w:szCs w:val="21"/>
-              </w:rPr>
-              <w:t>三目标</w:t>
-            </w:r>
-            <w:proofErr w:type="gramEnd"/>
-            <w:r>
-              <w:rPr>
-                <w:rFonts w:ascii="仿宋" w:eastAsia="仿宋" w:hAnsi="仿宋"/>
-                <w:sz w:val="21"/>
-                <w:szCs w:val="21"/>
-              </w:rPr>
-              <w:t>协同优化：</w:t>
+              <w:t>项目基于连续时间动力系统提出一体化“模拟计算启发训练”框架，围绕能效、稳定性与可复现性三目标协同优化：</w:t>
             </w:r>
           </w:p>
           <w:p>
@@ -3843,6 +3773,125 @@
                 <w:szCs w:val="24"/>
               </w:rPr>
             </w:pPr>
+            <w:r>
+              <w:rPr>
+                <w:rFonts w:ascii="仿宋" w:eastAsia="仿宋" w:hAnsi="仿宋" w:hint="eastAsia"/>
+                <w:b/>
+                <w:bCs/>
+                <w:noProof/>
+                <w:sz w:val="24"/>
+                <w:szCs w:val="24"/>
+              </w:rPr>
+              <mc:AlternateContent>
+                <mc:Choice Requires="wpi">
+                  <w:drawing>
+                    <wp:anchor distT="0" distB="0" distL="114300" distR="114300" simplePos="0" relativeHeight="251697152" behindDoc="0" locked="0" layoutInCell="1" allowOverlap="1" wp14:anchorId="6F29A3F1" wp14:editId="7542FDC4">
+                      <wp:simplePos x="0" y="0"/>
+                      <wp:positionH relativeFrom="column">
+                        <wp:posOffset>3458210</wp:posOffset>
+                      </wp:positionH>
+                      <wp:positionV relativeFrom="paragraph">
+                        <wp:posOffset>-111125</wp:posOffset>
+                      </wp:positionV>
+                      <wp:extent cx="1280760" cy="488950"/>
+                      <wp:effectExtent l="38100" t="38100" r="34290" b="44450"/>
+                      <wp:wrapNone/>
+                      <wp:docPr id="501478311" name="墨迹 31"/>
+                      <wp:cNvGraphicFramePr/>
+                      <a:graphic xmlns:a="http://schemas.openxmlformats.org/drawingml/2006/main">
+                        <a:graphicData uri="http://schemas.microsoft.com/office/word/2010/wordprocessingInk">
+                          <w14:contentPart bwMode="auto" r:id="rId8">
+                            <w14:nvContentPartPr>
+                              <w14:cNvContentPartPr/>
+                            </w14:nvContentPartPr>
+                            <w14:xfrm>
+                              <a:off x="0" y="0"/>
+                              <a:ext cx="1280760" cy="488950"/>
+                            </w14:xfrm>
+                          </w14:contentPart>
+                        </a:graphicData>
+                      </a:graphic>
+                    </wp:anchor>
+                  </w:drawing>
+                </mc:Choice>
+                <mc:Fallback>
+                  <w:pict>
+                    <v:shapetype w14:anchorId="45764B81" id="_x0000_t75" coordsize="21600,21600" o:spt="75" o:preferrelative="t" path="m@4@5l@4@11@9@11@9@5xe" filled="f" stroked="f">
+                      <v:stroke joinstyle="miter"/>
+                      <v:formulas>
+                        <v:f eqn="if lineDrawn pixelLineWidth 0"/>
+                        <v:f eqn="sum @0 1 0"/>
+                        <v:f eqn="sum 0 0 @1"/>
+                        <v:f eqn="prod @2 1 2"/>
+                        <v:f eqn="prod @3 21600 pixelWidth"/>
+                        <v:f eqn="prod @3 21600 pixelHeight"/>
+                        <v:f eqn="sum @0 0 1"/>
+                        <v:f eqn="prod @6 1 2"/>
+                        <v:f eqn="prod @7 21600 pixelWidth"/>
+                        <v:f eqn="sum @8 21600 0"/>
+                        <v:f eqn="prod @7 21600 pixelHeight"/>
+                        <v:f eqn="sum @10 21600 0"/>
+                      </v:formulas>
+                      <v:path o:extrusionok="f" gradientshapeok="t" o:connecttype="rect"/>
+                      <o:lock v:ext="edit" aspectratio="t"/>
+                    </v:shapetype>
+                    <v:shape id="墨迹 31" o:spid="_x0000_s1026" type="#_x0000_t75" style="position:absolute;margin-left:271.8pt;margin-top:-9.25pt;width:101.85pt;height:39.45pt;z-index:251697152;visibility:visible;mso-wrap-style:square;mso-wrap-distance-left:9pt;mso-wrap-distance-top:0;mso-wrap-distance-right:9pt;mso-wrap-distance-bottom:0;mso-position-horizontal:absolute;mso-position-horizontal-relative:text;mso-position-vertical:absolute;mso-position-vertical-relative:text" o:gfxdata="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">
+                      <v:imagedata r:id="rId9" o:title=""/>
+                    </v:shape>
+                  </w:pict>
+                </mc:Fallback>
+              </mc:AlternateContent>
+            </w:r>
+            <w:r>
+              <w:rPr>
+                <w:rFonts w:ascii="仿宋" w:eastAsia="仿宋" w:hAnsi="仿宋" w:hint="eastAsia"/>
+                <w:b/>
+                <w:bCs/>
+                <w:noProof/>
+                <w:sz w:val="24"/>
+                <w:szCs w:val="24"/>
+              </w:rPr>
+              <mc:AlternateContent>
+                <mc:Choice Requires="wpi">
+                  <w:drawing>
+                    <wp:anchor distT="0" distB="0" distL="114300" distR="114300" simplePos="0" relativeHeight="251683840" behindDoc="0" locked="0" layoutInCell="1" allowOverlap="1" wp14:anchorId="39E5102B" wp14:editId="2C164720">
+                      <wp:simplePos x="0" y="0"/>
+                      <wp:positionH relativeFrom="column">
+                        <wp:posOffset>3387090</wp:posOffset>
+                      </wp:positionH>
+                      <wp:positionV relativeFrom="paragraph">
+                        <wp:posOffset>-109855</wp:posOffset>
+                      </wp:positionV>
+                      <wp:extent cx="365400" cy="341080"/>
+                      <wp:effectExtent l="38100" t="38100" r="0" b="40005"/>
+                      <wp:wrapNone/>
+                      <wp:docPr id="144685805" name="墨迹 15"/>
+                      <wp:cNvGraphicFramePr/>
+                      <a:graphic xmlns:a="http://schemas.openxmlformats.org/drawingml/2006/main">
+                        <a:graphicData uri="http://schemas.microsoft.com/office/word/2010/wordprocessingInk">
+                          <w14:contentPart bwMode="auto" r:id="rId10">
+                            <w14:nvContentPartPr>
+                              <w14:cNvContentPartPr/>
+                            </w14:nvContentPartPr>
+                            <w14:xfrm>
+                              <a:off x="0" y="0"/>
+                              <a:ext cx="365400" cy="341080"/>
+                            </w14:xfrm>
+                          </w14:contentPart>
+                        </a:graphicData>
+                      </a:graphic>
+                    </wp:anchor>
+                  </w:drawing>
+                </mc:Choice>
+                <mc:Fallback>
+                  <w:pict>
+                    <v:shape w14:anchorId="5C1103D9" id="墨迹 15" o:spid="_x0000_s1026" type="#_x0000_t75" style="position:absolute;margin-left:266.2pt;margin-top:-9.15pt;width:29.75pt;height:27.8pt;z-index:251683840;visibility:visible;mso-wrap-style:square;mso-wrap-distance-left:9pt;mso-wrap-distance-top:0;mso-wrap-distance-right:9pt;mso-wrap-distance-bottom:0;mso-position-horizontal:absolute;mso-position-horizontal-relative:text;mso-position-vertical:absolute;mso-position-vertical-relative:text" o:gfxdata="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">
+                      <v:imagedata r:id="rId11" o:title=""/>
+                    </v:shape>
+                  </w:pict>
+                </mc:Fallback>
+              </mc:AlternateContent>
+            </w:r>
           </w:p>
           <w:p>
             <w:pPr>
@@ -3884,6 +3933,74 @@
                 <w:szCs w:val="24"/>
               </w:rPr>
             </w:pPr>
+            <w:r>
+              <w:rPr>
+                <w:rFonts w:ascii="仿宋" w:eastAsia="仿宋" w:hAnsi="仿宋" w:hint="eastAsia"/>
+                <w:noProof/>
+                <w:sz w:val="24"/>
+                <w:szCs w:val="24"/>
+                <w:lang w:val="zh-CN"/>
+              </w:rPr>
+              <mc:AlternateContent>
+                <mc:Choice Requires="wpi">
+                  <w:drawing>
+                    <wp:anchor distT="0" distB="0" distL="114300" distR="114300" simplePos="0" relativeHeight="251677696" behindDoc="0" locked="0" layoutInCell="1" allowOverlap="1" wp14:anchorId="2CE31700" wp14:editId="61A4B4DE">
+                      <wp:simplePos x="0" y="0"/>
+                      <wp:positionH relativeFrom="column">
+                        <wp:posOffset>3526155</wp:posOffset>
+                      </wp:positionH>
+                      <wp:positionV relativeFrom="paragraph">
+                        <wp:posOffset>-105410</wp:posOffset>
+                      </wp:positionV>
+                      <wp:extent cx="1038390" cy="462215"/>
+                      <wp:effectExtent l="57150" t="57150" r="9525" b="52705"/>
+                      <wp:wrapNone/>
+                      <wp:docPr id="706699093" name="墨迹 170"/>
+                      <wp:cNvGraphicFramePr/>
+                      <a:graphic xmlns:a="http://schemas.openxmlformats.org/drawingml/2006/main">
+                        <a:graphicData uri="http://schemas.microsoft.com/office/word/2010/wordprocessingInk">
+                          <w14:contentPart bwMode="auto" r:id="rId12">
+                            <w14:nvContentPartPr>
+                              <w14:cNvContentPartPr/>
+                            </w14:nvContentPartPr>
+                            <w14:xfrm>
+                              <a:off x="0" y="0"/>
+                              <a:ext cx="1038390" cy="462215"/>
+                            </w14:xfrm>
+                          </w14:contentPart>
+                        </a:graphicData>
+                      </a:graphic>
+                    </wp:anchor>
+                  </w:drawing>
+                </mc:Choice>
+                <mc:Fallback>
+                  <w:pict>
+                    <v:shapetype w14:anchorId="0A6CC051" id="_x0000_t75" coordsize="21600,21600" o:spt="75" o:preferrelative="t" path="m@4@5l@4@11@9@11@9@5xe" filled="f" stroked="f">
+                      <v:stroke joinstyle="miter"/>
+                      <v:formulas>
+                        <v:f eqn="if lineDrawn pixelLineWidth 0"/>
+                        <v:f eqn="sum @0 1 0"/>
+                        <v:f eqn="sum 0 0 @1"/>
+                        <v:f eqn="prod @2 1 2"/>
+                        <v:f eqn="prod @3 21600 pixelWidth"/>
+                        <v:f eqn="prod @3 21600 pixelHeight"/>
+                        <v:f eqn="sum @0 0 1"/>
+                        <v:f eqn="prod @6 1 2"/>
+                        <v:f eqn="prod @7 21600 pixelWidth"/>
+                        <v:f eqn="sum @8 21600 0"/>
+                        <v:f eqn="prod @7 21600 pixelHeight"/>
+                        <v:f eqn="sum @10 21600 0"/>
+                      </v:formulas>
+                      <v:path o:extrusionok="f" gradientshapeok="t" o:connecttype="rect"/>
+                      <o:lock v:ext="edit" aspectratio="t"/>
+                    </v:shapetype>
+                    <v:shape id="墨迹 170" o:spid="_x0000_s1026" type="#_x0000_t75" style="position:absolute;margin-left:276.95pt;margin-top:-9pt;width:83.15pt;height:37.85pt;z-index:251677696;visibility:visible;mso-wrap-style:square;mso-wrap-distance-left:9pt;mso-wrap-distance-top:0;mso-wrap-distance-right:9pt;mso-wrap-distance-bottom:0;mso-position-horizontal:absolute;mso-position-horizontal-relative:text;mso-position-vertical:absolute;mso-position-vertical-relative:text" o:gfxdata="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">
+                      <v:imagedata r:id="rId13" o:title=""/>
+                    </v:shape>
+                  </w:pict>
+                </mc:Fallback>
+              </mc:AlternateContent>
+            </w:r>
             <w:r>
               <w:rPr>
                 <w:rFonts w:ascii="仿宋" w:eastAsia="仿宋" w:hAnsi="仿宋" w:hint="eastAsia"/>
@@ -3964,8 +4081,8 @@
       </w:r>
     </w:p>
     <w:sectPr>
-      <w:footerReference w:type="even" r:id="rId8"/>
-      <w:footerReference w:type="default" r:id="rId9"/>
+      <w:footerReference w:type="even" r:id="rId14"/>
+      <w:footerReference w:type="default" r:id="rId15"/>
       <w:pgSz w:w="11906" w:h="16838"/>
       <w:pgMar w:top="992" w:right="1134" w:bottom="851" w:left="1134" w:header="709" w:footer="227" w:gutter="0"/>
       <w:cols w:space="720"/>
@@ -4520,6 +4637,7 @@
   <w:style w:type="character" w:default="1" w:styleId="a0">
     <w:name w:val="Default Paragraph Font"/>
     <w:uiPriority w:val="1"/>
+    <w:semiHidden/>
     <w:unhideWhenUsed/>
   </w:style>
   <w:style w:type="table" w:default="1" w:styleId="a1">
@@ -4679,6 +4797,131 @@
     </w:rPr>
   </w:style>
 </w:styles>
+</file>
+
+<file path=word/ink/ink1.xml><?xml version="1.0" encoding="utf-8"?>
+<inkml:ink xmlns:inkml="http://www.w3.org/2003/InkML">
+  <inkml:definitions>
+    <inkml:context xml:id="ctx0">
+      <inkml:inkSource xml:id="inkSrc0">
+        <inkml:traceFormat>
+          <inkml:channel name="X" type="integer" min="-2.14748E9" max="2.14748E9" units="cm"/>
+          <inkml:channel name="Y" type="integer" min="-2.14748E9" max="2.14748E9" units="cm"/>
+          <inkml:channel name="F" type="integer" max="32767" units="dev"/>
+          <inkml:channel name="OA" type="integer" max="360" units="deg"/>
+          <inkml:channel name="OE" type="integer" max="90" units="deg"/>
+        </inkml:traceFormat>
+        <inkml:channelProperties>
+          <inkml:channelProperty channel="X" name="resolution" value="1000" units="1/cm"/>
+          <inkml:channelProperty channel="Y" name="resolution" value="1000" units="1/cm"/>
+          <inkml:channelProperty channel="F" name="resolution" value="0" units="1/dev"/>
+          <inkml:channelProperty channel="OA" name="resolution" value="1000" units="1/deg"/>
+          <inkml:channelProperty channel="OE" name="resolution" value="1000" units="1/deg"/>
+        </inkml:channelProperties>
+      </inkml:inkSource>
+      <inkml:timestamp xml:id="ts0" timeString="2025-11-02T11:52:42.392"/>
+    </inkml:context>
+    <inkml:brush xml:id="br0">
+      <inkml:brushProperty name="width" value="0.035" units="cm"/>
+      <inkml:brushProperty name="height" value="0.035" units="cm"/>
+    </inkml:brush>
+  </inkml:definitions>
+  <inkml:trace contextRef="#ctx0" brushRef="#br0">147 888 516 0 0,'1'-4'1052'0'0,"0"0"0"0"0,0 0 0 0 0,0 0 0 0 0,1 0 0 0 0,0 0 0 0 0,0 0 0 0 0,0 0 0 0 0,0 1 0 0 0,5-6 528 0 0,-7 10-1462 0 0,1-1 1 0 0,-1 1 0 0 0,1 0 0 0 0,-1-1-1 0 0,0 1 1 0 0,1 0 0 0 0,-1-1-1 0 0,0 1 1 0 0,0 0 0 0 0,0 0 0 0 0,1-1-1 0 0,-1 1 1 0 0,0 0 0 0 0,0 0-1 0 0,0-1 1 0 0,0 1 0 0 0,0 0-1 0 0,0 0 1 0 0,-1 0 0 0 0,1-1 0 0 0,0 2-1 0 0,-3 20 204 0 0,3-21-216 0 0,-17 80-139 0 0,-2-1-1 0 0,-5-1 0 0 0,-37 84 1 0 0,57-151-253 0 0,-10 23-449 0 0,13-33 577 0 0,0 0-1 0 0,0 0 0 0 0,0 0 0 0 0,0-1 1 0 0,-1 1-1 0 0,1 0 0 0 0,0-1 0 0 0,-1 1 0 0 0,1-1 1 0 0,-1 1-1 0 0,1-1 0 0 0,-1 0 0 0 0,-2 2 1 0 0,3-3 106 0 0,1 0 0 0 0,0 0 0 0 0,0 0 0 0 0,0 0 0 0 0,-1 0 0 0 0,1 1 0 0 0,0-1 1 0 0,0 0-1 0 0,0 0 0 0 0,0 0 0 0 0,-1 0 0 0 0,1 0 0 0 0,0 0 0 0 0,0 0 0 0 0,0-1 0 0 0,-1 1 1 0 0,1 0-1 0 0,0 0 0 0 0,0 0 0 0 0,0 0 0 0 0,-1 0 0 0 0,1 0 0 0 0,0 0 0 0 0,0 0 0 0 0,0 0 1 0 0,0 0-1 0 0,0-1 0 0 0,-1 1 0 0 0,1 0 0 0 0,0 0 0 0 0,0 0 0 0 0,0 0 0 0 0,0 0 0 0 0,0-1 0 0 0,0 1 1 0 0,0 0-1 0 0,-1 0 0 0 0,1 0 0 0 0,0 0 0 0 0,0-1 0 0 0,-1-11-1191 0 0,5-11-188 0 0,-1 10 928 0 0,0 1-1 0 0,1-1 1 0 0,1 1 0 0 0,0 0-1 0 0,1 0 1 0 0,0 1 0 0 0,1-1-1 0 0,0 1 1 0 0,17-19 0 0 0,-17 23 900 0 0,1 0 0 0 0,0 0 1 0 0,0 0-1 0 0,0 1 0 0 0,1 1 0 0 0,-1-1 1 0 0,1 1-1 0 0,1 1 0 0 0,-1 0 1 0 0,1 0-1 0 0,0 1 0 0 0,-1 0 0 0 0,12-1 1 0 0,235-19 6330 0 0,-15 3-4687 0 0,148-68-1631 0 0,-142 29-1355 0 0,-207 50-377 0 0,-2-1 0 0 0,44-17 0 0 0,-71 23 602 0 0,-1-1 1 0 0,1 0-1 0 0,-1 0 1 0 0,-1-1-1 0 0,1-1 1 0 0,-1 1-1 0 0,0-2 1 0 0,0 1-1 0 0,-1-1 1 0 0,0-1-1 0 0,-1 1 1 0 0,9-14 0 0 0,-7 8-325 0 0</inkml:trace>
+  <inkml:trace contextRef="#ctx0" brushRef="#br0" timeOffset="443.5">829 552 516 0 0,'0'0'159'0'0,"0"0"0"0"0,0-1 0 0 0,0 1-1 0 0,0 0 1 0 0,0-1 0 0 0,0 1 0 0 0,0-1 0 0 0,0 1 0 0 0,0 0 0 0 0,1-1-1 0 0,-1 1 1 0 0,0 0 0 0 0,0-1 0 0 0,0 1 0 0 0,0 0 0 0 0,1-1-1 0 0,-1 1 1 0 0,0 0 0 0 0,0 0 0 0 0,1-1 0 0 0,-1 1 0 0 0,0 0 0 0 0,0 0-1 0 0,1-1 1 0 0,-1 1 0 0 0,0 0 0 0 0,1 0 0 0 0,-1 0 0 0 0,0-1 0 0 0,1 1-1 0 0,-1 0 1 0 0,1 0 0 0 0,15 2 2527 0 0,20 13-825 0 0,-31-12-1428 0 0,107 55 2632 0 0,70 32-1930 0 0,-171-85-1379 0 0,25 9-364 0 0,-34-14 337 0 0,0 1 0 0 0,1 0 0 0 0,-1-1 0 0 0,1 0 0 0 0,-1 1 1 0 0,1-1-1 0 0,-1 0 0 0 0,0 0 0 0 0,1 0 0 0 0,-1-1 0 0 0,1 1 0 0 0,2-1 0 0 0,-4 0 113 0 0,-1 1 0 0 0,0 0 0 0 0,1-1 0 0 0,-1 1 0 0 0,0-1 0 0 0,1 1-1 0 0,-1 0 1 0 0,0-1 0 0 0,0 1 0 0 0,1-1 0 0 0,-1 1 0 0 0,0-1 0 0 0,0 1 0 0 0,0-1 0 0 0,0 1-1 0 0,1-1 1 0 0,-1 1 0 0 0,0-1 0 0 0,0 1 0 0 0,0-1 0 0 0,0 1 0 0 0,0-1 0 0 0,0 1 0 0 0,-1-1-1 0 0,1 1 1 0 0,0-1 0 0 0,0 1 0 0 0,0-1 0 0 0,0 1 0 0 0,-1-1 0 0 0,1 1 0 0 0,0-1-1 0 0,0 1 1 0 0,-1-1 0 0 0,1 1 0 0 0,-13-23-2466 0 0,11 19 1881 0 0,-3-5-162 0 0</inkml:trace>
+  <inkml:trace contextRef="#ctx0" brushRef="#br0" timeOffset="579.54">1128 444 684 0 0,'-9'8'788'0'0,"0"2"0"0"0,1-1 0 0 0,0 1 1 0 0,1 0-1 0 0,0 1 0 0 0,1 0 0 0 0,-10 21 0 0 0,2-4 118 0 0,10-21-739 0 0,-75 145 1902 0 0,64-119-2838 0 0,2 0 1 0 0,-16 60-1 0 0,28-92 645 0 0,1 0 1 0 0,0-1 0 0 0,0 1 0 0 0,-1-1-1 0 0,1 1 1 0 0,0-1 0 0 0,0 1 0 0 0,0-1-1 0 0,0 1 1 0 0,0 0 0 0 0,0-1 0 0 0,0 1-1 0 0,0 0 1 0 0,0-1 0 0 0,0 1 0 0 0,0-1-1 0 0,0 1 1 0 0,0-1 0 0 0,0 1 0 0 0,0 0-1 0 0,1-1 1 0 0,-1 1 0 0 0,0-1 0 0 0,0 1-1 0 0,1-1 1 0 0,0 2 0 0 0,-1-3-47 0 0,1 1 1 0 0,0-1-1 0 0,0 1 1 0 0,0-1-1 0 0,-1 0 1 0 0,1 1-1 0 0,0-1 0 0 0,-1 0 1 0 0,1 1-1 0 0,0-1 1 0 0,-1 0-1 0 0,1 0 1 0 0,-1 1-1 0 0,1-1 0 0 0,-1 0 1 0 0,1 0-1 0 0,-1-1 1 0 0,5-7-700 0 0</inkml:trace>
+  <inkml:trace contextRef="#ctx0" brushRef="#br0" timeOffset="1261.04">1599 65 700 0 0,'31'-61'7529'0'0,"-31"61"-7467"0"0,0 0 0 0 0,1-1 0 0 0,-1 1-1 0 0,0 0 1 0 0,1 0 0 0 0,-1-1 0 0 0,0 1-1 0 0,0 0 1 0 0,1 0 0 0 0,-1 0 0 0 0,1 0-1 0 0,-1-1 1 0 0,0 1 0 0 0,1 0 0 0 0,-1 0-1 0 0,0 0 1 0 0,1 0 0 0 0,-1 0 0 0 0,0 0-1 0 0,1 0 1 0 0,-1 0 0 0 0,1 0 0 0 0,-1 0-1 0 0,0 0 1 0 0,1 0 0 0 0,-1 0 0 0 0,0 0-1 0 0,1 1 1 0 0,-1-1 0 0 0,0 0 0 0 0,1 0-1 0 0,-1 0 1 0 0,0 0 0 0 0,1 1 0 0 0,-1-1-1 0 0,0 0 1 0 0,1 0 0 0 0,-1 1 0 0 0,0-1-1 0 0,0 0 1 0 0,1 0 0 0 0,-1 1 0 0 0,0-1-1 0 0,0 0 1 0 0,0 1 0 0 0,1-1 0 0 0,-1 0-1 0 0,0 1 1 0 0,0-1 0 0 0,0 0 0 0 0,0 1-1 0 0,0-1 1 0 0,0 1 0 0 0,0 0 0 0 0,9 22 745 0 0,-8-21-662 0 0,6 24 290 0 0,-1 1 0 0 0,-2 0 0 0 0,-1 0 0 0 0,0 0 0 0 0,-3 43 0 0 0,-4-7-314 0 0,-16 81 0 0 0,17-131-115 0 0,1 1 1 0 0,-2-1-1 0 0,0 0 1 0 0,0 0-1 0 0,-1-1 1 0 0,-1 1-1 0 0,-10 16 0 0 0,15-27-2 0 0,36-23-8 0 0,-10 7 4 0 0,-22 12-6 0 0,133-94-331 0 0,-114 79-429 0 0,-2-1 1 0 0,0-1-1 0 0,-1-1 1 0 0,17-23-1 0 0,-33 40 388 0 0,-1 0 0 0 0,0 0 0 0 0,0-1 0 0 0,0 1 0 0 0,0-1 0 0 0,-1 1 0 0 0,1-1 0 0 0,-1 0 0 0 0,0 1 0 0 0,0-1 0 0 0,0 0 0 0 0,0-7 0 0 0,-1 9 187 0 0,-1 0 0 0 0,1 0 0 0 0,0 0-1 0 0,-1 1 1 0 0,0-1 0 0 0,1 0 0 0 0,-1 0 0 0 0,0 1-1 0 0,0-1 1 0 0,1 0 0 0 0,-1 1 0 0 0,-1-1 0 0 0,1 1-1 0 0,0 0 1 0 0,0-1 0 0 0,0 1 0 0 0,-1 0 0 0 0,1 0-1 0 0,-1-1 1 0 0,1 1 0 0 0,-1 0 0 0 0,1 1 0 0 0,-1-1-1 0 0,0 0 1 0 0,1 0 0 0 0,-1 1 0 0 0,0-1 0 0 0,-3 0-1 0 0,-10-3-547 0 0</inkml:trace>
+  <inkml:trace contextRef="#ctx0" brushRef="#br0" timeOffset="1787.97">1521 256 684 0 0,'0'0'156'0'0,"-1"0"1"0"0,1-1-1 0 0,-1 1 0 0 0,1 0 1 0 0,-1-1-1 0 0,1 1 1 0 0,0-1-1 0 0,-1 1 0 0 0,1 0 1 0 0,-1-1-1 0 0,1 1 0 0 0,0-1 1 0 0,-1 1-1 0 0,1-1 0 0 0,0 1 1 0 0,0-1-1 0 0,-1 1 0 0 0,1-1 1 0 0,0 1-1 0 0,0-1 0 0 0,0 0 1 0 0,0 1-1 0 0,0-1 1 0 0,0 1-1 0 0,0-1 0 0 0,0 1 1 0 0,0-2-1 0 0,7-20 2271 0 0,19-19-333 0 0,-24 39-1887 0 0,16-24 179 0 0,-6 7-248 0 0,1 1 0 0 0,1 0 0 0 0,0 1 0 0 0,2 1-1 0 0,0 0 1 0 0,27-21 0 0 0,-42 36-129 0 0,1 0-1 0 0,-1 0 0 0 0,0 0 1 0 0,0 1-1 0 0,1-1 1 0 0,-1 0-1 0 0,1 0 1 0 0,-1 1-1 0 0,0-1 1 0 0,1 1-1 0 0,-1 0 1 0 0,1-1-1 0 0,-1 1 1 0 0,1 0-1 0 0,0 0 1 0 0,-1 0-1 0 0,1 0 1 0 0,-1 0-1 0 0,1 0 1 0 0,-1 0-1 0 0,1 1 1 0 0,-1-1-1 0 0,1 0 1 0 0,-1 1-1 0 0,1-1 1 0 0,-1 1-1 0 0,0 0 1 0 0,1-1-1 0 0,-1 1 1 0 0,0 0-1 0 0,1 0 0 0 0,-1 0 1 0 0,0 0-1 0 0,0 0 1 0 0,0 0-1 0 0,0 0 1 0 0,0 0-1 0 0,0 1 1 0 0,0-1-1 0 0,0 0 1 0 0,-1 1-1 0 0,1-1 1 0 0,0 0-1 0 0,-1 1 1 0 0,1 1-1 0 0,4 9 131 0 0,-2 0-1 0 0,1 0 0 0 0,-2 1 0 0 0,3 18 1 0 0,-3-18-33 0 0,23 160 1006 0 0,38 228 862 0 0,-16-149-1759 0 0,-47-251-221 0 0,0 0-1 0 0,1 0 1 0 0,-1 1-1 0 0,0-1 1 0 0,0 0-1 0 0,0 0 1 0 0,0 0-1 0 0,0 1 1 0 0,0-1-1 0 0,0 0 1 0 0,0 0 0 0 0,-1 0-1 0 0,1 0 1 0 0,0 1-1 0 0,-1-1 1 0 0,1 0-1 0 0,-1 0 1 0 0,1 0-1 0 0,-1 0 1 0 0,1 0-1 0 0,-1 0 1 0 0,0 0 0 0 0,0 0-1 0 0,0 0 1 0 0,1 0-1 0 0,-1 0 1 0 0,0-1-1 0 0,0 1 1 0 0,0 0-1 0 0,0-1 1 0 0,0 1-1 0 0,0 0 1 0 0,0-1-1 0 0,-1 0 1 0 0,1 1 0 0 0,0-1-1 0 0,0 1 1 0 0,0-1-1 0 0,0 0 1 0 0,-1 0-1 0 0,1 0 1 0 0,0 0-1 0 0,0 0 1 0 0,0 0-1 0 0,-1 0 1 0 0,1 0-1 0 0,-1-1 1 0 0,-10 0-255 0 0,1-1 0 0 0,0 0 0 0 0,0-1 0 0 0,-12-4 0 0 0,12 4-111 0 0,-38-11-2468 0 0,-52-6 0 0 0,99 19 2977 0 0,-1 1-1 0 0,1 0 1 0 0,0-1-1 0 0,0 1 0 0 0,0-1 1 0 0,0 1-1 0 0,-1-1 1 0 0,1 0-1 0 0,0 0 0 0 0,0 0 1 0 0,1 0-1 0 0,-1-1 1 0 0,0 1-1 0 0,0 0 0 0 0,0-1 1 0 0,1 1-1 0 0,-1-1 1 0 0,1 0-1 0 0,-1 1 1 0 0,1-1-1 0 0,-2-3 0 0 0,3 3-7 0 0,-1 0 0 0 0,1-1 1 0 0,-1 1-1 0 0,1-1 0 0 0,0 1 0 0 0,0 0 0 0 0,0-1 0 0 0,0 1 0 0 0,0-1 0 0 0,1 1 0 0 0,-1 0 0 0 0,1-1 0 0 0,0 1 0 0 0,-1 0 1 0 0,1 0-1 0 0,0-1 0 0 0,0 1 0 0 0,1 0 0 0 0,1-3 0 0 0,27-37 182 0 0,1 2-1 0 0,1 1 1 0 0,47-43 0 0 0,1-1-1134 0 0,-45 44 206 0 0,109-125-4313 0 0,-110 121 2463 0 0,-2-1 1 0 0,26-48-1 0 0,-45 70 1628 0 0</inkml:trace>
+  <inkml:trace contextRef="#ctx0" brushRef="#br0" timeOffset="2159.71">2156 87 608 0 0,'-22'12'8995'0'0,"34"-18"-7874"0"0,-6 4-952 0 0,10-6 134 0 0,1 0 0 0 0,0 2 0 0 0,0 0 0 0 0,0 1 0 0 0,34-6 0 0 0,-50 11-306 0 0,0 0 1 0 0,0 0-1 0 0,1 0 1 0 0,-1 0-1 0 0,0 0 1 0 0,0 0-1 0 0,1 0 1 0 0,-1 1-1 0 0,0-1 1 0 0,0 0-1 0 0,0 1 1 0 0,0-1-1 0 0,1 0 1 0 0,-1 1-1 0 0,0 0 1 0 0,0-1 0 0 0,0 1-1 0 0,0 0 1 0 0,0-1-1 0 0,0 1 1 0 0,0 0-1 0 0,0 0 1 0 0,1 1-1 0 0,-2 0-22 0 0,1 0 1 0 0,0 0-1 0 0,-1-1 0 0 0,1 1 0 0 0,-1 0 0 0 0,1 0 0 0 0,-1 0 0 0 0,0 0 1 0 0,0 0-1 0 0,0 0 0 0 0,0 0 0 0 0,0-1 0 0 0,-1 4 0 0 0,-1 7-202 0 0,-1-1 0 0 0,-1 1 0 0 0,-9 19 0 0 0,11-26 154 0 0,-94 186-2288 0 0,55-116 3266 0 0,-33 85-1 0 0,72-156-685 0 0,0 1 1 0 0,1 0-1 0 0,0 0 0 0 0,-1 0 0 0 0,1 0 0 0 0,1 0 0 0 0,-1 6 1 0 0,1-10-175 0 0,0 0-1 0 0,0 0 1 0 0,1 0 0 0 0,-1 0 0 0 0,0 0 0 0 0,0 0 0 0 0,1 0 0 0 0,-1 0 0 0 0,1 0 0 0 0,-1 0 0 0 0,1 0 0 0 0,-1-1 0 0 0,1 1 0 0 0,0 0 0 0 0,-1 0 0 0 0,1-1 0 0 0,0 1 0 0 0,0 0 0 0 0,-1-1 0 0 0,1 1 0 0 0,0 0 0 0 0,0-1 0 0 0,0 1 0 0 0,0-1 0 0 0,0 0 0 0 0,0 1 0 0 0,0-1 0 0 0,0 0 0 0 0,0 1 0 0 0,0-1 0 0 0,0 0 0 0 0,0 0 0 0 0,0 0 0 0 0,0 0 0 0 0,0 0 0 0 0,0 0 0 0 0,0 0 0 0 0,0 0 0 0 0,0-1 0 0 0,0 1 0 0 0,1-1 0 0 0,13-1 138 0 0,-1-2-1 0 0,0 1 1 0 0,0-2-1 0 0,0 0 1 0 0,21-11-1 0 0,66-43 135 0 0,-33 18-267 0 0,-29 21-117 0 0,-26 14-288 0 0,0 0 1 0 0,-1-1-1 0 0,0 0 1 0 0,-1-1-1 0 0,16-12 1 0 0,-26 19 182 0 0,-1 0 0 0 0,1 0 0 0 0,0 0 0 0 0,-1 0 0 0 0,1 1 0 0 0,-1-1 0 0 0,0 0 0 0 0,1 0 0 0 0,-1 0 0 0 0,0 0 0 0 0,1 0 0 0 0,-1 0 0 0 0,0 0 0 0 0,0 0 0 0 0,0 0 0 0 0,0 0 0 0 0,0 0 0 0 0,0 0 0 0 0,0 0 0 0 0,0 0 0 0 0,-1 0 0 0 0,1 0 0 0 0,0 0 0 0 0,-1 0 0 0 0,1 0 0 0 0,0 0 0 0 0,-1 0 1 0 0,1 0-1 0 0,-1 1 0 0 0,1-1 0 0 0,-1 0 0 0 0,0 0 0 0 0,1 0 0 0 0,-2 0 0 0 0,-4-6-896 0 0,0 1 1 0 0,-1 0 0 0 0,-8-6 0 0 0,6 5 50 0 0,-3-3 39 0 0,-1-1 80 0 0</inkml:trace>
+  <inkml:trace contextRef="#ctx0" brushRef="#br0" timeOffset="2344.72">2245 146 60 0 0,'3'2'540'0'0,"-1"1"-1"0"0,0 0 1 0 0,0 0 0 0 0,-1 0-1 0 0,1 1 1 0 0,0-1 0 0 0,-1 0-1 0 0,0 1 1 0 0,0-1 0 0 0,0 0-1 0 0,1 8 1 0 0,-1-7-112 0 0,10 51 2495 0 0,5 61 0 0 0,-5 58-755 0 0,11 82-1288 0 0,-21-245-967 0 0,10 42-444 0 0,-10-51 363 0 0,-1 1 1 0 0,1 0-1 0 0,0-1 0 0 0,0 1 1 0 0,1-1-1 0 0,-1 1 1 0 0,0-1-1 0 0,1 0 0 0 0,0 0 1 0 0,-1 1-1 0 0,1-1 1 0 0,0 0-1 0 0,0-1 0 0 0,0 1 1 0 0,0 0-1 0 0,3 1 0 0 0,-4-2 6 0 0,0-1-1 0 0,0 0 0 0 0,0 1 1 0 0,0-1-1 0 0,1 0 1 0 0,-1 0-1 0 0,0 0 0 0 0,0 0 1 0 0,0 0-1 0 0,0 0 0 0 0,0 0 1 0 0,0 0-1 0 0,1 0 0 0 0,-1-1 1 0 0,0 1-1 0 0,0 0 0 0 0,0-1 1 0 0,0 1-1 0 0,0-1 0 0 0,0 1 1 0 0,0-1-1 0 0,0 0 0 0 0,0 1 1 0 0,-1-1-1 0 0,1 0 0 0 0,0 0 1 0 0,0 1-1 0 0,0-1 0 0 0,-1 0 1 0 0,1 0-1 0 0,0 0 0 0 0,-1 0 1 0 0,1 0-1 0 0,-1 0 0 0 0,1 0 1 0 0,-1-1-1 0 0,4-6-840 0 0,-1 1 1 0 0,0-1-1 0 0,3-12 0 0 0,-6 19 927 0 0,5-16-1018 0 0,-1 0 143 0 0</inkml:trace>
+  <inkml:trace contextRef="#ctx0" brushRef="#br0" timeOffset="2687.33">2722 262 272 0 0,'-8'10'1417'0'0,"0"1"0"0"0,1 0 1 0 0,1 1-1 0 0,-1 0 0 0 0,2 0 0 0 0,-5 12 0 0 0,5-9-1216 0 0,1 0-1 0 0,0 1 0 0 0,1-1 0 0 0,1 0 0 0 0,0 1 0 0 0,1 0 0 0 0,1-1 1 0 0,2 21-1 0 0,-2-33-193 0 0,0 0 0 0 0,0-1 0 0 0,1 1 0 0 0,0 0 1 0 0,-1-1-1 0 0,1 1 0 0 0,0 0 0 0 0,0-1 0 0 0,1 0 0 0 0,-1 1 0 0 0,0-1 1 0 0,1 0-1 0 0,0 1 0 0 0,-1-1 0 0 0,1 0 0 0 0,0 0 0 0 0,3 3 0 0 0,-3-5-33 0 0,-1 1-1 0 0,1 0 0 0 0,0-1 0 0 0,-1 1 0 0 0,1-1 0 0 0,-1 0 0 0 0,1 0 0 0 0,0 1 0 0 0,-1-1 0 0 0,1 0 0 0 0,0 0 1 0 0,-1-1-1 0 0,1 1 0 0 0,0 0 0 0 0,-1 0 0 0 0,1-1 0 0 0,-1 1 0 0 0,1-1 0 0 0,-1 1 0 0 0,1-1 0 0 0,-1 0 1 0 0,1 0-1 0 0,-1 0 0 0 0,1 0 0 0 0,-1 0 0 0 0,0 0 0 0 0,0 0 0 0 0,1 0 0 0 0,-1 0 0 0 0,1-2 0 0 0,12-13-990 0 0,0-1 1 0 0,-2 0-1 0 0,0-1 0 0 0,0 0 0 0 0,-2-1 0 0 0,9-23 0 0 0,16-27-2392 0 0,-26 54 2724 0 0</inkml:trace>
+  <inkml:trace contextRef="#ctx0" brushRef="#br0" timeOffset="2846.02">2890 269 128 0 0,'16'-22'1714'0'0,"-15"21"-1558"0"0,-1 0 0 0 0,0 1 0 0 0,1-1 1 0 0,-1 0-1 0 0,1 1 0 0 0,-1-1 0 0 0,1 0 0 0 0,0 1 0 0 0,-1-1 0 0 0,1 1 0 0 0,0-1 0 0 0,-1 1 0 0 0,1-1 0 0 0,0 1 0 0 0,0 0 1 0 0,-1-1-1 0 0,1 1 0 0 0,0 0 0 0 0,0-1 0 0 0,0 1 0 0 0,-1 0 0 0 0,1 0 0 0 0,0 0 0 0 0,0 0 0 0 0,0 0 0 0 0,0 0 0 0 0,-1 0 1 0 0,3 0-1 0 0,-2 2 58 0 0,0-1 0 0 0,0 0 1 0 0,0 1-1 0 0,0-1 1 0 0,0 0-1 0 0,0 1 1 0 0,-1-1-1 0 0,1 1 1 0 0,-1 0-1 0 0,1-1 0 0 0,-1 1 1 0 0,1-1-1 0 0,-1 1 1 0 0,0 0-1 0 0,1 2 1 0 0,0 29 760 0 0,-2-26-650 0 0,1 16 324 0 0,-6 40 1 0 0,4-54-637 0 0,1 1-1 0 0,-2-1 1 0 0,0 0-1 0 0,0 0 1 0 0,0 0 0 0 0,-10 16-1 0 0,13-24-82 0 0,-1 1-1 0 0,0-1 0 0 0,1 0 1 0 0,-1 0-1 0 0,0 0 1 0 0,0 0-1 0 0,0 0 1 0 0,0 0-1 0 0,0 0 1 0 0,0 0-1 0 0,0 0 1 0 0,0 0-1 0 0,-1 0 0 0 0,1-1 1 0 0,0 1-1 0 0,0-1 1 0 0,-1 1-1 0 0,1-1 1 0 0,0 1-1 0 0,-1-1 1 0 0,1 0-1 0 0,0 1 0 0 0,-1-1 1 0 0,-1 0-1 0 0,1 0-161 0 0,0-1 0 0 0,0 0 0 0 0,0 1 0 0 0,0-1-1 0 0,0 0 1 0 0,0 0 0 0 0,0 0 0 0 0,0 0-1 0 0,0 0 1 0 0,1-1 0 0 0,-1 1 0 0 0,0-1 0 0 0,-2-2-1 0 0,-5-6-1174 0 0,1-1-1 0 0,1 0 0 0 0,-13-22 1 0 0,19 30 1296 0 0,-8-14-737 0 0,0-1 85 0 0</inkml:trace>
+  <inkml:trace contextRef="#ctx0" brushRef="#br0" timeOffset="3198.18">2677 36 584 0 0,'0'-1'163'0'0,"0"0"0"0"0,0 1-1 0 0,0-1 1 0 0,0 0 0 0 0,0 0-1 0 0,0 1 1 0 0,0-1 0 0 0,1 0 0 0 0,-1 0-1 0 0,0 1 1 0 0,0-1 0 0 0,1 0 0 0 0,-1 1-1 0 0,1-1 1 0 0,-1 0 0 0 0,1 1-1 0 0,-1-1 1 0 0,1 1 0 0 0,-1-1 0 0 0,1 1-1 0 0,-1-1 1 0 0,1 1 0 0 0,0-1 0 0 0,-1 1-1 0 0,1-1 1 0 0,0 1 0 0 0,0 0 14 0 0,0 1 1 0 0,0-1-1 0 0,-1 1 0 0 0,1-1 1 0 0,0 1-1 0 0,-1 0 1 0 0,1-1-1 0 0,0 1 1 0 0,-1 0-1 0 0,1-1 0 0 0,-1 1 1 0 0,1 0-1 0 0,-1 0 1 0 0,0 0-1 0 0,1 0 0 0 0,-1-1 1 0 0,1 3-1 0 0,11 43 2560 0 0,-12-46-2737 0 0,13 82 2078 0 0,4 142-1 0 0,-18-122-2787 0 0,-27 199 0 0 0,29-312-1277 0 0,1-5 854 0 0,0-1 0 0 0,2 1 1 0 0,0 0-1 0 0,7-20 1 0 0,-9 33 1046 0 0,4-11 187 0 0,1 0-1 0 0,10-16 1 0 0,-16 27 107 0 0,1 1-1 0 0,-1-1 0 0 0,1 1 0 0 0,0 0 0 0 0,0 0 0 0 0,0 0 0 0 0,0 0 1 0 0,0 0-1 0 0,0 0 0 0 0,0 0 0 0 0,1 1 0 0 0,-1-1 0 0 0,1 1 0 0 0,-1 0 1 0 0,1-1-1 0 0,0 1 0 0 0,-1 0 0 0 0,1 1 0 0 0,5-2 0 0 0,-5 2 3 0 0,-1 1 1 0 0,1-1-1 0 0,-1 1 0 0 0,1-1 0 0 0,-1 1 0 0 0,1 0 0 0 0,-1 0 0 0 0,1 0 1 0 0,-1 0-1 0 0,0 1 0 0 0,0-1 0 0 0,3 2 0 0 0,27 26 1091 0 0,-3-4-671 0 0,-23-21-745 0 0,0-1-1 0 0,-1 0 1 0 0,1-1 0 0 0,0 1-1 0 0,0-1 1 0 0,0 0-1 0 0,1-1 1 0 0,-1 0-1 0 0,0 0 1 0 0,1 0-1 0 0,-1 0 1 0 0,12-2-1 0 0,1-1-2364 0 0,1-1 0 0 0,33-9 0 0 0,-10 1-2552 0 0,-33 9 4118 0 0</inkml:trace>
+  <inkml:trace contextRef="#ctx0" brushRef="#br0" timeOffset="3784.57">3027 137 300 0 0,'3'-34'2156'0'0,"-2"18"1019"0"0,6-31 0 0 0,-7 46-3125 0 0,0 1 0 0 0,0 0 0 0 0,0 0 0 0 0,0 0 0 0 0,0 0 0 0 0,0 0 0 0 0,0 0 0 0 0,0 0 0 0 0,0 0 0 0 0,0 0 0 0 0,0 0 0 0 0,0-1 0 0 0,1 1 0 0 0,-1 0 0 0 0,0 0 0 0 0,0 0 0 0 0,0 0 0 0 0,0 0 0 0 0,0 0 0 0 0,0 0 0 0 0,0 0 0 0 0,0 0 0 0 0,0 0 0 0 0,0 0 0 0 0,0 0 0 0 0,0 0 0 0 0,0 0 0 0 0,1 0 0 0 0,-1 0 0 0 0,0 0 0 0 0,0 0-1 0 0,0 0 1 0 0,0 0 0 0 0,0 0 0 0 0,0 0 0 0 0,0 0 0 0 0,0 0 0 0 0,0 0 0 0 0,1 0 0 0 0,-1 0 0 0 0,0 0 0 0 0,0 0 0 0 0,0 0 0 0 0,0 0 0 0 0,0 0 0 0 0,0 0 0 0 0,0 0 0 0 0,0 0 0 0 0,0 0 0 0 0,0 0 0 0 0,0 0 0 0 0,1 0 0 0 0,-1 0 0 0 0,0 0 0 0 0,0 0 0 0 0,0 0 0 0 0,0 0 0 0 0,0 1 0 0 0,0-1 0 0 0,0 0 0 0 0,0 0 0 0 0,0 0 0 0 0,0 0 0 0 0,0 0 0 0 0,0 0 0 0 0,6 10 1034 0 0,4 13-515 0 0,4 35 507 0 0,12 106-1 0 0,-9 63-840 0 0,-14-162-122 0 0,1-11-115 0 0,2 75-683 0 0,-6-129 665 0 0,0 0 0 0 0,0 0 0 0 0,0 0 0 0 0,0 0 0 0 0,0 0 0 0 0,0 1 1 0 0,0-1-1 0 0,0 0 0 0 0,0 0 0 0 0,0 0 0 0 0,0 0 0 0 0,0 0 0 0 0,0 0 0 0 0,0 0 0 0 0,0 1 0 0 0,0-1 0 0 0,0 0 0 0 0,0 0 0 0 0,0 0 0 0 0,0 0 0 0 0,0 0 0 0 0,0 0 1 0 0,0 0-1 0 0,0 0 0 0 0,0 1 0 0 0,0-1 0 0 0,0 0 0 0 0,0 0 0 0 0,0 0 0 0 0,0 0 0 0 0,-1 0 0 0 0,1 0 0 0 0,0 0 0 0 0,0 0 0 0 0,0 0 0 0 0,0 0 0 0 0,0 0 0 0 0,0 0 1 0 0,0 0-1 0 0,0 0 0 0 0,0 1 0 0 0,-1-1 0 0 0,1 0 0 0 0,0 0 0 0 0,0 0 0 0 0,0 0 0 0 0,0 0 0 0 0,0 0 0 0 0,0 0 0 0 0,0 0 0 0 0,-1 0 0 0 0,1 0 0 0 0,0 0 1 0 0,0-1-1 0 0,0 1 0 0 0,0 0 0 0 0,0 0 0 0 0,0 0 0 0 0,0 0 0 0 0,-1 0 0 0 0,-7-7-865 0 0,-5-12-426 0 0,-16-31-1570 0 0,22 37 2570 0 0,0 0 0 0 0,0 1 1 0 0,-1 0-1 0 0,-1 0 0 0 0,0 1 0 0 0,0 0 0 0 0,-12-11 1 0 0,20 21 402 0 0,0 1 0 0 0,0-1 0 0 0,0 0-1 0 0,0 0 1 0 0,0 1 0 0 0,0-1 0 0 0,0 0 0 0 0,0 1 0 0 0,0-1 0 0 0,0 1 0 0 0,0 0 0 0 0,-1-1 0 0 0,1 1 0 0 0,0 0 0 0 0,0-1 0 0 0,0 1 0 0 0,-1 0 0 0 0,1 0 0 0 0,0 0 0 0 0,0 0 0 0 0,0 1 0 0 0,-1-1 0 0 0,-1 0 0 0 0,2 1 35 0 0,0 0 1 0 0,-1 0 0 0 0,1 0-1 0 0,0 0 1 0 0,0 0-1 0 0,0 0 1 0 0,0 0-1 0 0,0 1 1 0 0,1-1 0 0 0,-1 0-1 0 0,0 0 1 0 0,0 1-1 0 0,1-1 1 0 0,-1 0-1 0 0,1 1 1 0 0,-1 1 0 0 0,-1 4 204 0 0,1-1 1 0 0,0 0 0 0 0,0 1 0 0 0,1-1 0 0 0,-1 1 0 0 0,2-1-1 0 0,0 12 1 0 0,0-14-250 0 0,0 1 0 0 0,0-1-1 0 0,1 1 1 0 0,-1-1 0 0 0,1 0-1 0 0,0 1 1 0 0,0-1 0 0 0,1 0-1 0 0,-1 0 1 0 0,1-1 0 0 0,-1 1 0 0 0,1 0-1 0 0,1-1 1 0 0,-1 0 0 0 0,0 0-1 0 0,1 0 1 0 0,0 0 0 0 0,-1 0-1 0 0,1-1 1 0 0,0 1 0 0 0,0-1-1 0 0,6 2 1 0 0,-2-2-56 0 0,1 1 0 0 0,-1-2 0 0 0,1 1 0 0 0,-1-1-1 0 0,1-1 1 0 0,-1 1 0 0 0,1-2 0 0 0,-1 1 0 0 0,1-1 0 0 0,-1 0 0 0 0,11-3-1 0 0,30-11-271 0 0,-1-1 0 0 0,70-36 0 0 0,-77 34-663 0 0,-16 5-1824 0 0,-1-1 1 0 0,42-31-1 0 0,-45 30-528 0 0,-12 11 1532 0 0,-5 2 925 0 0</inkml:trace>
+  <inkml:trace contextRef="#ctx0" brushRef="#br0" timeOffset="3913.24">3548 564 60 0 0,'1'4'502'0'0,"1"0"-1"0"0,-1 0 1 0 0,1 0-1 0 0,-1 0 1 0 0,0 0-1 0 0,-1 0 1 0 0,1 1-1 0 0,-1-1 1 0 0,0 0-1 0 0,0 0 1 0 0,0 5-1 0 0,-10 50 3384 0 0,2-16-2516 0 0,6-17-1334 0 0,2-16-1664 0 0,-1 1 1 0 0,-4 19 0 0 0,5-30 1492 0 0,0 1 0 0 0,0-1 0 0 0,-1 0-1 0 0,1 1 1 0 0,0-1 0 0 0,0 0 0 0 0,-1 0 0 0 0,1 1 0 0 0,0-1 0 0 0,0 0 0 0 0,-1 0-1 0 0,1 0 1 0 0,0 1 0 0 0,-1-1 0 0 0,1 0 0 0 0,0 0 0 0 0,-1 0 0 0 0,1 0 0 0 0,-1 0-1 0 0,1 0 1 0 0,0 0 0 0 0,-1 0 0 0 0,1 0 0 0 0,0 0 0 0 0,-1 0 0 0 0,1 0 0 0 0,0 0-1 0 0,-1 0 1 0 0,1 0 0 0 0,-1 0 0 0 0,1 0 0 0 0,0 0 0 0 0,-1 0 0 0 0,1 0 0 0 0,0-1-1 0 0,-1 1 1 0 0,1 0 0 0 0,0 0 0 0 0,-1 0 0 0 0,1-1 0 0 0,-3-2-653 0 0</inkml:trace>
+</inkml:ink>
+</file>
+
+<file path=word/ink/ink2.xml><?xml version="1.0" encoding="utf-8"?>
+<inkml:ink xmlns:inkml="http://www.w3.org/2003/InkML">
+  <inkml:definitions>
+    <inkml:context xml:id="ctx0">
+      <inkml:inkSource xml:id="inkSrc0">
+        <inkml:traceFormat>
+          <inkml:channel name="X" type="integer" min="-2.14748E9" max="2.14748E9" units="cm"/>
+          <inkml:channel name="Y" type="integer" min="-2.14748E9" max="2.14748E9" units="cm"/>
+          <inkml:channel name="F" type="integer" max="32767" units="dev"/>
+          <inkml:channel name="OA" type="integer" max="360" units="deg"/>
+          <inkml:channel name="OE" type="integer" max="90" units="deg"/>
+        </inkml:traceFormat>
+        <inkml:channelProperties>
+          <inkml:channelProperty channel="X" name="resolution" value="1000" units="1/cm"/>
+          <inkml:channelProperty channel="Y" name="resolution" value="1000" units="1/cm"/>
+          <inkml:channelProperty channel="F" name="resolution" value="0" units="1/dev"/>
+          <inkml:channelProperty channel="OA" name="resolution" value="1000" units="1/deg"/>
+          <inkml:channelProperty channel="OE" name="resolution" value="1000" units="1/deg"/>
+        </inkml:channelProperties>
+      </inkml:inkSource>
+      <inkml:timestamp xml:id="ts0" timeString="2025-11-02T11:52:37.371"/>
+    </inkml:context>
+    <inkml:brush xml:id="br0">
+      <inkml:brushProperty name="width" value="0.035" units="cm"/>
+      <inkml:brushProperty name="height" value="0.035" units="cm"/>
+    </inkml:brush>
+  </inkml:definitions>
+  <inkml:trace contextRef="#ctx0" brushRef="#br0">459 359 1024 0 0,'-14'3'2519'0'0,"-18"1"2545"0"0,26-4-2041 0 0,12-3 428 0 0,8-3-3289 0 0,0 0 0 0 0,-1-1 0 0 0,0 0 0 0 0,0-1 0 0 0,18-15 0 0 0,56-56-141 0 0,-65 58 0 0 0,-4 4-174 0 0,3-2-193 0 0,19-23 0 0 0,-36 37-26 0 0,0 0 0 0 0,0 0-1 0 0,0-1 1 0 0,-1 1 0 0 0,0-1-1 0 0,0 0 1 0 0,0 0 0 0 0,-1 0 0 0 0,0-1-1 0 0,2-7 1 0 0,-4 12 101 0 0,0 0 0 0 0,1 0 0 0 0,-1 0 0 0 0,-1 0 0 0 0,1 0 0 0 0,0 0 0 0 0,0 0 0 0 0,-1 0 0 0 0,1 0 1 0 0,-1 0-1 0 0,0 0 0 0 0,0 0 0 0 0,0 0 0 0 0,0 0 0 0 0,0 0 0 0 0,0 0 0 0 0,0 1 0 0 0,0-1 0 0 0,-1 0 0 0 0,1 1 0 0 0,-1-1 0 0 0,1 1 0 0 0,-1-1 0 0 0,0 1 0 0 0,1 0 0 0 0,-1 0 0 0 0,0 0 0 0 0,0 0 0 0 0,0 0 0 0 0,0 0 1 0 0,0 1-1 0 0,0-1 0 0 0,0 0 0 0 0,0 1 0 0 0,-3-1 0 0 0,-6 0-622 0 0</inkml:trace>
+  <inkml:trace contextRef="#ctx0" brushRef="#br0" timeOffset="141.32">609 15 300 0 0,'-5'1'276'0'0,"0"0"0"0"0,1 1 0 0 0,0-1 0 0 0,-1 1 0 0 0,1 1 0 0 0,0-1 0 0 0,0 0 0 0 0,0 1 0 0 0,1 0 0 0 0,-1 0 0 0 0,0 0 0 0 0,1 0 0 0 0,0 1 0 0 0,0-1 0 0 0,0 1 0 0 0,0 0 0 0 0,1 0 0 0 0,-1 0 0 0 0,1 0 0 0 0,-2 5 0 0 0,2-1-11 0 0,0-1 0 0 0,1 1 0 0 0,-1 0 0 0 0,1 0-1 0 0,1 0 1 0 0,0 0 0 0 0,0 0 0 0 0,0-1 0 0 0,1 1 0 0 0,0 0-1 0 0,3 9 1 0 0,16 54 763 0 0,-12-46-836 0 0,-1 1 0 0 0,7 48 0 0 0,-14-65-382 0 0,1-1 1 0 0,-1 1-1 0 0,-1-1 0 0 0,1 1 1 0 0,-2-1-1 0 0,1 0 0 0 0,-1 1 1 0 0,0-1-1 0 0,-1 0 0 0 0,0 0 1 0 0,0 0-1 0 0,-1-1 0 0 0,-5 10 1 0 0,0-3-585 0 0,-1-1 0 0 0,-1 0 1 0 0,0 0-1 0 0,-25 20 0 0 0,-57 36-2399 0 0,67-50 2484 0 0</inkml:trace>
+  <inkml:trace contextRef="#ctx0" brushRef="#br0" timeOffset="405.86">224 768 180 0 0,'-34'23'816'0'0,"-82"59"2680"0"0,43-23 2135 0 0,102-77-1289 0 0,21-12-3724 0 0,247-190 643 0 0,226-152-1147 0 0,-504 360-138 0 0,-11 6 2 0 0,1 0-1 0 0,-1 1 1 0 0,1 0 0 0 0,0 0 0 0 0,0 1 0 0 0,0 0-1 0 0,1 1 1 0 0,11-3 0 0 0,-21 6 21 0 0,0 0-1 0 0,0 0 1 0 0,1 0 0 0 0,-1 0-1 0 0,0 0 1 0 0,0 0-1 0 0,0 0 1 0 0,0 0 0 0 0,0 0-1 0 0,0 0 1 0 0,1 0 0 0 0,-1 0-1 0 0,0 0 1 0 0,0 0-1 0 0,0 0 1 0 0,0 0 0 0 0,0 0-1 0 0,0 0 1 0 0,0 0 0 0 0,0 0-1 0 0,1 0 1 0 0,-1 0-1 0 0,0 0 1 0 0,0 0 0 0 0,0 0-1 0 0,0 0 1 0 0,0 0-1 0 0,0 1 1 0 0,0-1 0 0 0,0 0-1 0 0,0 0 1 0 0,0 0 0 0 0,1 0-1 0 0,-1 0 1 0 0,0 0-1 0 0,0 0 1 0 0,0 0 0 0 0,0 0-1 0 0,0 1 1 0 0,0-1-1 0 0,0 0 1 0 0,0 0 0 0 0,0 0-1 0 0,0 0 1 0 0,0 0 0 0 0,0 0-1 0 0,0 1 1 0 0,0-1-1 0 0,0 0 1 0 0,0 0 0 0 0,0 0-1 0 0,0 0 1 0 0,0 0 0 0 0,0 0-1 0 0,-6 9-34 0 0,-8 7 7 0 0,-133 109-613 0 0,45-47-5931 0 0,95-73 4606 0 0,0 0 1 0 0,0-1-1 0 0,-13 5 0 0 0,15-7 1100 0 0</inkml:trace>
+  <inkml:trace contextRef="#ctx0" brushRef="#br0" timeOffset="640.21">571 691 536 0 0,'7'16'1640'0'0,"0"0"-1"0"0,-1 1 0 0 0,-1 0 1 0 0,4 23-1 0 0,12 34-477 0 0,-19-66-1121 0 0,1-1 0 0 0,1 0 0 0 0,0 1 0 0 0,0-1 0 0 0,0-1 0 0 0,1 1 1 0 0,6 7-1 0 0,-11-13-136 0 0,1-1 1 0 0,-1 1-1 0 0,1 0 1 0 0,-1 0-1 0 0,1-1 1 0 0,0 1-1 0 0,-1 0 1 0 0,1-1-1 0 0,0 1 1 0 0,0-1-1 0 0,-1 1 1 0 0,1-1-1 0 0,0 1 1 0 0,0-1-1 0 0,0 1 1 0 0,0-1-1 0 0,0 0 1 0 0,0 1-1 0 0,-1-1 1 0 0,1 0-1 0 0,0 0 1 0 0,0 0-1 0 0,0 0 1 0 0,0 0-1 0 0,0 0 1 0 0,0 0-1 0 0,0 0 1 0 0,0 0-1 0 0,0 0 1 0 0,0-1-1 0 0,1 1 1 0 0,-1-1-106 0 0,0 0 1 0 0,-1 0-1 0 0,1 0 1 0 0,0 0 0 0 0,-1 0-1 0 0,1-1 1 0 0,-1 1 0 0 0,1 0-1 0 0,-1 0 1 0 0,0 0 0 0 0,1 0-1 0 0,-1-1 1 0 0,0 1-1 0 0,0 0 1 0 0,0 0 0 0 0,0-1-1 0 0,0 1 1 0 0,0 0 0 0 0,0 0-1 0 0,-1 0 1 0 0,1-1 0 0 0,0 1-1 0 0,-1 0 1 0 0,0-2 0 0 0,-1-6-626 0 0,-1 0 50 0 0</inkml:trace>
+  <inkml:trace contextRef="#ctx0" brushRef="#br0" timeOffset="823.92">640 799 416 0 0,'0'0'945'0'0,"16"-10"6503"0"0,64-27-3796 0 0,36-24-2355 0 0,-96 49-1254 0 0,-3 2-561 0 0,0 1-1 0 0,1 0 1 0 0,23-8-1 0 0,-61 35-5491 0 0,-53 26 1263 0 0,53-33 3973 0 0</inkml:trace>
+</inkml:ink>
+</file>
+
+<file path=word/ink/ink3.xml><?xml version="1.0" encoding="utf-8"?>
+<inkml:ink xmlns:inkml="http://www.w3.org/2003/InkML">
+  <inkml:definitions>
+    <inkml:context xml:id="ctx0">
+      <inkml:inkSource xml:id="inkSrc0">
+        <inkml:traceFormat>
+          <inkml:channel name="X" type="integer" min="-2.14748E9" max="2.14748E9" units="cm"/>
+          <inkml:channel name="Y" type="integer" min="-2.14748E9" max="2.14748E9" units="cm"/>
+          <inkml:channel name="F" type="integer" max="32767" units="dev"/>
+          <inkml:channel name="OA" type="integer" max="360" units="deg"/>
+          <inkml:channel name="OE" type="integer" max="90" units="deg"/>
+        </inkml:traceFormat>
+        <inkml:channelProperties>
+          <inkml:channelProperty channel="X" name="resolution" value="1000" units="1/cm"/>
+          <inkml:channelProperty channel="Y" name="resolution" value="1000" units="1/cm"/>
+          <inkml:channelProperty channel="F" name="resolution" value="0" units="1/dev"/>
+          <inkml:channelProperty channel="OA" name="resolution" value="1000" units="1/deg"/>
+          <inkml:channelProperty channel="OE" name="resolution" value="1000" units="1/deg"/>
+        </inkml:channelProperties>
+      </inkml:inkSource>
+      <inkml:timestamp xml:id="ts0" timeString="2025-11-02T06:04:08.423"/>
+    </inkml:context>
+    <inkml:brush xml:id="br0">
+      <inkml:brushProperty name="width" value="0.05" units="cm"/>
+      <inkml:brushProperty name="height" value="0.05" units="cm"/>
+    </inkml:brush>
+  </inkml:definitions>
+  <inkml:trace contextRef="#ctx0" brushRef="#br0">507 177 6200 0 0,'0'0'1666'0'0,"17"13"-1212"0"0,19 29 875 0 0,-29-28-670 0 0,-7-14-361 0 0,5 7 1020 0 0</inkml:trace>
+  <inkml:trace contextRef="#ctx0" brushRef="#br0" timeOffset="389.94">786 79 6104 0 0,'0'0'7322'0'0,"-8"20"-7204"0"0,-3 4-562 0 0,-1-1 1 0 0,-16 23 0 0 0</inkml:trace>
+  <inkml:trace contextRef="#ctx0" brushRef="#br0" timeOffset="1045.27">429 362 5008 0 0,'0'0'896'0'0,"26"-1"-536"0"0,-2-3 61 0 0,0-2 1 0 0,-1-1 0 0 0,1-1-1 0 0,22-11 1 0 0,-24 10-115 0 0,1 0 0 0 0,-1 1 0 0 0,1 2 1 0 0,33-6-1 0 0,-26 11-3 0 0,-29 1-363 0 0,2-2-1312 0 0</inkml:trace>
+  <inkml:trace contextRef="#ctx0" brushRef="#br0" timeOffset="1383.83">385 649 5176 0 0,'0'0'-55'0'0,"3"-1"-90"0"0,225-107 3553 0 0,-121 69-1861 0 0,-83 31-1544 0 0,-23 7 65 0 0,0 1-4 0 0,2 0-48 0 0,-2 0 38 0 0</inkml:trace>
+  <inkml:trace contextRef="#ctx0" brushRef="#br0" timeOffset="1934.26">653 357 5776 0 0,'3'1'4136'0'0,"-2"0"-3752"0"0,1 2-23 0 0,-2 0-201 0 0,0 1 0 0 0,0-1 1 0 0,-1 0-1 0 0,1 1 0 0 0,-1-1 0 0 0,0 0 0 0 0,1 0 0 0 0,-2 0 1 0 0,1 1-1 0 0,0-1 0 0 0,-3 4 0 0 0,3-5 5 0 0,-5 16-228 0 0,1-1-1 0 0,1 2 1 0 0,1-1 0 0 0,0 0 0 0 0,0 34 0 0 0,1-23-36 0 0,-7 36 1 0 0,-4 17-134 0 0,13-81 520 0 0,0 0 1 0 0,0 3-44 0 0,0-1-218 0 0,0-2-70 0 0,0 4-2749 0 0</inkml:trace>
+  <inkml:trace contextRef="#ctx0" brushRef="#br0" timeOffset="2274.42">499 812 5256 0 0,'-8'2'706'0'0,"-4"3"-317"0"0,10-4-159 0 0,1 0 0 0 0,-1 0-1 0 0,0 0 1 0 0,0-1 0 0 0,0 1-1 0 0,0 0 1 0 0,0-1 0 0 0,0 0-1 0 0,0 1 1 0 0,0-1 0 0 0,0 0-1 0 0,-3 0 1 0 0,30-15 673 0 0,5-2-933 0 0,91-41 416 0 0,-107 52-144 0 0,0 1 0 0 0,1 0 0 0 0,0 2 0 0 0,0-1 0 0 0,0 2 0 0 0,25-1 0 0 0,-14-4-1739 0 0</inkml:trace>
+  <inkml:trace contextRef="#ctx0" brushRef="#br0" timeOffset="2837.25">633 779 6024 0 0,'0'0'3912'0'0,"1"4"-3743"0"0,1-1 0 0 0,-1 1 0 0 0,0 0 0 0 0,1 0 0 0 0,-2 1 0 0 0,1-1 0 0 0,0 0 0 0 0,-1 0-1 0 0,0 0 1 0 0,0 0 0 0 0,0 1 0 0 0,-1-1 0 0 0,1 0 0 0 0,-1 0 0 0 0,0 0 0 0 0,0 0 0 0 0,-2 4 0 0 0,-3 9 118 0 0,-1-1-1 0 0,-14 25 0 0 0,18-36-153 0 0,-43 65 563 0 0,32-52-439 0 0,11-15-244 0 0,-1 1 1 0 0,1 0-1 0 0,0 1 0 0 0,1-1 0 0 0,-1 0 0 0 0,1 1 0 0 0,-3 6 1 0 0,4-9-13 0 0,1 0 1 0 0,0 0 0 0 0,-1 0 0 0 0,1 0-1 0 0,0 1 1 0 0,0-1 0 0 0,0 0-1 0 0,0 0 1 0 0,0 0 0 0 0,1 0 0 0 0,-1 0-1 0 0,1 0 1 0 0,-1 0 0 0 0,1 0 0 0 0,0 0-1 0 0,-1-1 1 0 0,1 1 0 0 0,0 0 0 0 0,0 0-1 0 0,2 2 1 0 0,2 2 9 0 0,1 1 0 0 0,-1-1 0 0 0,10 8-1 0 0,-6-6-5 0 0,-1-1-251 0 0,1 1 1 0 0,0-2-1 0 0,0 1 1 0 0,1-1-1 0 0,0-1 1 0 0,18 9-1 0 0,2-3-1084 0 0,33 7-1 0 0,-18-6 821 0 0,-45-12 479 0 0,10 3-130 0 0,-1 0 0 0 0,0 0 0 0 0,-1 1 0 0 0,1 0 0 0 0,-1 0 0 0 0,1 1 1 0 0,9 7 1087 0 0,-17-11-474 0 0,2 1 1267 0 0,-5-3-1932 0 0,1 1 164 0 0,-1-1 1 0 0,1 0-1 0 0,-1 0 0 0 0,1 0 0 0 0,0 0 0 0 0,-1-1 1 0 0,1 1-1 0 0,0 0 0 0 0,0 0 0 0 0,0-1 0 0 0,0 1 1 0 0,0-1-1 0 0,0 1 0 0 0,0-1 0 0 0,-1-1 0 0 0,1 0-788 0 0</inkml:trace>
+  <inkml:trace contextRef="#ctx0" brushRef="#br0" timeOffset="3723.15">824 960 5512 0 0,'0'0'4753'0'0,"-9"-3"-4082"0"0,8 3-635 0 0,0 0 0 0 0,0 0 0 0 0,0 0 0 0 0,0 0 0 0 0,0 1 0 0 0,0-1 0 0 0,0 0 0 0 0,0 0 0 0 0,0 1 0 0 0,1-1 0 0 0,-1 0 0 0 0,0 1 0 0 0,0-1 0 0 0,0 1 0 0 0,0 0 0 0 0,0-1 0 0 0,1 1 0 0 0,-1-1 0 0 0,0 1 0 0 0,0 0 0 0 0,1 0 0 0 0,-1 0 0 0 0,1-1 0 0 0,-1 1 0 0 0,0 0 0 0 0,1 0 0 0 0,0 0 0 0 0,-1 0 0 0 0,1 0 1 0 0,0 0-1 0 0,-1 0 0 0 0,1 2 0 0 0,-2 0 12 0 0,-6 12 81 0 0,-44 69 1036 0 0,44-73-862 0 0,-1-1-1 0 0,0 0 0 0 0,-1 0 0 0 0,0-1 1 0 0,-14 11-1 0 0,-7 3 39 0 0,16-10-308 0 0,0-2 0 0 0,-1 0 0 0 0,0-1 1 0 0,-1-1-1 0 0,0 0 0 0 0,-1-1 0 0 0,-34 11 1 0 0,17-12-106 0 0,1-2 1 0 0,-1 0 0 0 0,-1-3 0 0 0,1-1 0 0 0,0-1 0 0 0,0-2 0 0 0,0-2 0 0 0,-54-12 0 0 0,80 13 21 0 0,0 0 0 0 0,1 0 0 0 0,-1 0 0 0 0,1-1 0 0 0,0-1 0 0 0,0 0 0 0 0,0 0 0 0 0,-8-6 0 0 0,15 10-19 0 0,1 0 0 0 0,-1 1 0 0 0,0-1 0 0 0,0 0 0 0 0,1 0-1 0 0,-1 1 1 0 0,1-1 0 0 0,-1 0 0 0 0,0 0 0 0 0,1 0 0 0 0,0 0 0 0 0,-1 0 0 0 0,1 0-1 0 0,-1 0 1 0 0,1 0 0 0 0,0 0 0 0 0,0 0 0 0 0,0 0 0 0 0,0 0 0 0 0,0 0 0 0 0,0 0-1 0 0,0 0 1 0 0,0 0 0 0 0,0 0 0 0 0,0 0 0 0 0,0 0 0 0 0,0 0 0 0 0,1 0 0 0 0,-1 0-1 0 0,0 0 1 0 0,1 0 0 0 0,-1 0 0 0 0,1 0 0 0 0,1-1 0 0 0,0-2-16 0 0,1 0 1 0 0,0 0-1 0 0,0 1 1 0 0,0-1-1 0 0,5-4 1 0 0,1 1-40 0 0,0 1 1 0 0,0 0-1 0 0,1 0 1 0 0,0 1-1 0 0,19-8 1 0 0,57-14-213 0 0,-59 19 214 0 0,69-22-18 0 0,106-27-361 0 0,17 9 190 0 0,-18-6 262 0 0,-170 47 114 0 0,50-4 1 0 0,-39 7-43 0 0,-28 2 127 0 0,0 2 0 0 0,1 0 0 0 0,-1 1 0 0 0,27 4 0 0 0,1-2-1270 0 0,-40-3 952 0 0,-3-5 3774 0 0,-24-9-3097 0 0,-2-1-624 0 0,23 13 47 0 0,-10-8-283 0 0,1 0 0 0 0,-1 0 0 0 0,-12-15 0 0 0</inkml:trace>
+  <inkml:trace contextRef="#ctx0" brushRef="#br0" timeOffset="4194.05">1114 453 9496 0 0,'0'0'57'0'0,"1"-1"-25"0"0,14-10 157 0 0,0 1-1 0 0,1 1 1 0 0,0 0 0 0 0,0 1 0 0 0,28-9-1 0 0,-18 6 95 0 0,32-16 1 0 0,-56 26-254 0 0,2-2 183 0 0,1 1 0 0 0,0 0 0 0 0,0 0 0 0 0,0 0 0 0 0,8-2 0 0 0,-5 5-1727 0 0</inkml:trace>
+  <inkml:trace contextRef="#ctx0" brushRef="#br0" timeOffset="4730.54">1117 684 6952 0 0,'3'-2'320'0'0,"197"-134"2548"0"0,-175 112-2799 0 0,-20 19 94 0 0,-1 1 1 0 0,1-1-1 0 0,0 1 0 0 0,0 0 1 0 0,0 0-1 0 0,0 0 0 0 0,11-4 1 0 0,-16 7 433 0 0,-18 15 186 0 0,15-12-738 0 0,1 1 0 0 0,0-1 1 0 0,0 1-1 0 0,0 0 0 0 0,1-1 1 0 0,-1 1-1 0 0,1 0 0 0 0,-1 0 1 0 0,1 0-1 0 0,0 0 1 0 0,0 0-1 0 0,0 0 0 0 0,1 1 1 0 0,-1-1-1 0 0,1 6 0 0 0,-1 6-35 0 0,1 1-1 0 0,3 17 1 0 0,0 3-67 0 0,-5 58-148 0 0,4 105-29 0 0,3-167-2 0 0,1 21 886 0 0,-7-50-594 0 0,1-2 426 0 0,-5-26-1783 0 0,6 7 769 0 0,1-1 1 0 0,6-21-1 0 0</inkml:trace>
+  <inkml:trace contextRef="#ctx0" brushRef="#br0" timeOffset="5100">1732 105 7128 0 0,'0'0'4040'0'0,"0"11"-3096"0"0,-4 12-818 0 0,-1-1 1 0 0,-1 0-1 0 0,-1 0 0 0 0,-14 32 1 0 0,15-40-159 0 0,-21 47 360 0 0,-4-2 0 0 0,-54 79 1 0 0,78-126-180 0 0,-2 0 0 0 0,-13 14 1 0 0,19-22-213 0 0,-1 0 0 0 0,0-1 1 0 0,0 0-1 0 0,0 0 0 0 0,0 0 1 0 0,0 0-1 0 0,-1-1 1 0 0,1 0-1 0 0,-1 0 0 0 0,-6 2 1 0 0,11-4 57 0 0,0 0 1 0 0,0 0-1 0 0,-1 0 1 0 0,1 0 0 0 0,0 0-1 0 0,0 0 1 0 0,-1 0 0 0 0,1 0-1 0 0,0 0 1 0 0,0-1-1 0 0,0 1 1 0 0,-1 0 0 0 0,1 0-1 0 0,0 0 1 0 0,0 0-1 0 0,0-1 1 0 0,-1 1 0 0 0,1 0-1 0 0,0 0 1 0 0,0 0-1 0 0,0-1 1 0 0,0 1 0 0 0,0 0-1 0 0,0 0 1 0 0,-1 0 0 0 0,1-1-1 0 0,0 1 1 0 0,0 0-1 0 0,0 0 1 0 0,0-1 0 0 0,0 1-1 0 0,0 0 1 0 0,0 0-1 0 0,0-1 1 0 0,0 1 0 0 0,0 0-1 0 0,0 0 1 0 0,0-1 0 0 0,0 1-1 0 0,0 0 1 0 0,1 0-1 0 0,-1-1 1 0 0,0 1 0 0 0,1-9-1609 0 0</inkml:trace>
+  <inkml:trace contextRef="#ctx0" brushRef="#br0" timeOffset="5384.48">1681 320 6360 0 0,'82'33'-676'0'0,"131"35"0"0"0,-188-62 235 0 0,0 2 0 0 0,-1 1 0 0 0,0 0-1 0 0,0 2 1 0 0,34 21 0 0 0,-54-28 440 0 0,9 5 1138 0 0,-13-13 1374 0 0,-9-10 1238 0 0,-1 5-3907 0 0,-1 0-1 0 0,0 1 1 0 0,0 0-1 0 0,-17-8 1 0 0</inkml:trace>
+  <inkml:trace contextRef="#ctx0" brushRef="#br0" timeOffset="5615.62">1596 537 10256 0 0,'0'0'2024'0'0,"2"0"-1518"0"0,21-5-89 0 0,0 0-1 0 0,0-1 1 0 0,41-18-1 0 0,-22 8-444 0 0,-24 8-148 0 0,-14 7 43 0 0,-1-1 1 0 0,0 0-1 0 0,1 1 0 0 0,-1-1 0 0 0,1 1 1 0 0,0 0-1 0 0,0 0 0 0 0,-1 0 1 0 0,1 1-1 0 0,0 0 0 0 0,0-1 0 0 0,-1 1 1 0 0,1 0-1 0 0,0 1 0 0 0,0-1 0 0 0,6 2 1 0 0</inkml:trace>
+  <inkml:trace contextRef="#ctx0" brushRef="#br0" timeOffset="5831.21">1441 782 11104 0 0,'0'0'1264'0'0,"3"-1"-768"0"0,30-7-561 0 0,1-3 1 0 0,-1-1-1 0 0,38-19 1 0 0,8-4 71 0 0,-4 10 372 0 0,18-9-298 0 0,-90 33-166 0 0,27-17-1137 0 0,-29 17 700 0 0,-9-12-1673 0 0</inkml:trace>
+  <inkml:trace contextRef="#ctx0" brushRef="#br0" timeOffset="6264.22">1760 553 8736 0 0,'-3'11'3294'0'0,"14"26"-2763"0"0,-8-28-365 0 0,0 0 0 0 0,-1 1 0 0 0,0-1 1 0 0,1 13-1 0 0,20 261-2732 0 0,-22-280 3134 0 0,-2 4 590 0 0,1-7-1142 0 0,0 0 0 0 0,0 0 1 0 0,-1 1-1 0 0,1-1 0 0 0,0 0 1 0 0,-1 0-1 0 0,1 0 0 0 0,0 0 0 0 0,-1 1 1 0 0,1-1-1 0 0,0 0 0 0 0,-1 0 1 0 0,1 0-1 0 0,-1 0 0 0 0,1 0 1 0 0,0 0-1 0 0,-1 0 0 0 0,1 0 1 0 0,0 0-1 0 0,-1 0 0 0 0,1 0 1 0 0,0 0-1 0 0,-1 0 0 0 0,1-1 1 0 0,0 1-1 0 0,-1 0 0 0 0,1 0 1 0 0,0 0-1 0 0,-1 0 0 0 0,1-1 0 0 0,0 1 1 0 0,-1 0-1 0 0,-13-8 462 0 0,13 7-462 0 0,-10-6-7 0 0,1-1 1 0 0,0 0-1 0 0,1-1 0 0 0,0 1 1 0 0,0-2-1 0 0,-11-16 1 0 0,8 11 27 0 0,-25-25 0 0 0,35 38-9 0 0,0 1 0 0 0,0-1 0 0 0,0 0 0 0 0,0 1 0 0 0,0-1 1 0 0,-1 1-1 0 0,1-1 0 0 0,0 1 0 0 0,-1 0 0 0 0,1 0 0 0 0,-1 0 0 0 0,1 1 1 0 0,-1-1-1 0 0,1 1 0 0 0,-1-1 0 0 0,0 1 0 0 0,1 0 0 0 0,-6 0 1 0 0,6 0-3 0 0,-1 1-1 0 0,1 0 1 0 0,-1 0 0 0 0,1 0 0 0 0,0 1 0 0 0,-1-1 0 0 0,1 0 0 0 0,0 1 0 0 0,0 0 0 0 0,0-1 0 0 0,0 1 0 0 0,0 0 0 0 0,1 0 0 0 0,-1 0 0 0 0,0 0 0 0 0,1 0 0 0 0,0 1 0 0 0,-3 3 0 0 0,-17 34 46 0 0,-24 40 144 0 0,26-53-579 0 0,5-6-802 0 0,-15 27-1 0 0</inkml:trace>
+  <inkml:trace contextRef="#ctx0" brushRef="#br0" timeOffset="6561.57">1865 786 8312 0 0,'22'3'511'0'0,"0"0"0"0"0,0 2 0 0 0,-1 0 0 0 0,1 1-1 0 0,-1 2 1 0 0,-1 0 0 0 0,1 1 0 0 0,24 15 0 0 0,-16-3-2091 0 0,-19-14 982 0 0,0 1 0 0 0,19 10 0 0 0,-26-17 531 0 0,2 1 3351 0 0,-8-14-4457 0 0</inkml:trace>
+  <inkml:trace contextRef="#ctx0" brushRef="#br0" timeOffset="6938.18">2521 1 10008 0 0,'0'0'494'0'0,"2"1"-359"0"0,3 3-68 0 0,0 0 0 0 0,0 0 0 0 0,0-1 0 0 0,0 0-1 0 0,1 0 1 0 0,0-1 0 0 0,6 3 0 0 0,35 18 257 0 0,-43-20-835 0 0</inkml:trace>
+  <inkml:trace contextRef="#ctx0" brushRef="#br0" timeOffset="7809.03">2581 71 7208 0 0,'-6'-2'179'0'0,"0"1"0"0"0,0 0 0 0 0,0 0 0 0 0,0 0 0 0 0,0 1 1 0 0,0-1-1 0 0,0 2 0 0 0,0-1 0 0 0,-9 2 0 0 0,11 0-39 0 0,0-1-1 0 0,-1 1 1 0 0,1 0 0 0 0,1 0-1 0 0,-1 0 1 0 0,0 1 0 0 0,0-1-1 0 0,1 1 1 0 0,-1 0 0 0 0,1 0-1 0 0,0 0 1 0 0,0 0 0 0 0,-4 7-1 0 0,-172 205 2259 0 0,179-215-2399 0 0,0 1 1 0 0,0-1-1 0 0,0 0 0 0 0,0 0 1 0 0,-1 0-1 0 0,1 0 1 0 0,0 0-1 0 0,0 0 1 0 0,0 1-1 0 0,0-1 1 0 0,0 0-1 0 0,-1 0 1 0 0,1 0-1 0 0,0 0 0 0 0,0 1 1 0 0,0-1-1 0 0,0 0 1 0 0,0 0-1 0 0,0 0 1 0 0,0 1-1 0 0,0-1 1 0 0,0 0-1 0 0,0 0 1 0 0,0 0-1 0 0,0 1 1 0 0,0-1-1 0 0,0 0 0 0 0,0 0 1 0 0,0 0-1 0 0,0 1 1 0 0,0-1-1 0 0,0 0 1 0 0,0 0-1 0 0,0 0 1 0 0,0 1-1 0 0,0-1 1 0 0,0 0-1 0 0,0 0 0 0 0,1 0 1 0 0,-1 0-1 0 0,0 1 1 0 0,0-1-1 0 0,0 0 1 0 0,0 0-1 0 0,0 0 1 0 0,0 0-1 0 0,1 0 1 0 0,-1 0-1 0 0,0 1 0 0 0,0-1 1 0 0,0 0-1 0 0,1 0 1 0 0,-1 0-1 0 0,0 0 1 0 0,0 0-1 0 0,0 0 1 0 0,1 0-1 0 0,-1 0 1 0 0,0 0-1 0 0,0 0 1 0 0,0 0-1 0 0,1 0 0 0 0,9 1-220 0 0,22-9 152 0 0,-1 0 1 0 0,-1-3 0 0 0,38-17 0 0 0,-4 2 82 0 0,102-30 92 0 0,-134 47-39 0 0,1 2-1 0 0,0 1 1 0 0,41-2-1 0 0,-51 9 135 0 0,-23-1-198 0 0,1 0 1 0 0,-1 0-1 0 0,0 0 0 0 0,1 0 0 0 0,-1 0 0 0 0,0 0 0 0 0,0 0 0 0 0,1 0 0 0 0,-1 0 0 0 0,0 1 1 0 0,0-1-1 0 0,1 0 0 0 0,-1 0 0 0 0,0 0 0 0 0,0 0 0 0 0,1 0 0 0 0,-1 1 0 0 0,0-1 1 0 0,0 0-1 0 0,0 0 0 0 0,1 0 0 0 0,-1 1 0 0 0,0-1 0 0 0,0 0 0 0 0,0 0 0 0 0,0 1 1 0 0,0-1-1 0 0,1 0 0 0 0,-1 0 0 0 0,0 1 0 0 0,0-1 0 0 0,0 0 0 0 0,0 1 0 0 0,0-1 1 0 0,0 0-1 0 0,0 0 0 0 0,0 1 0 0 0,0-1 0 0 0,0 0 0 0 0,0 0 0 0 0,0 1 0 0 0,0-1 1 0 0,0 0-1 0 0,0 1 0 0 0,0-1 0 0 0,-1 0 0 0 0,1 0 0 0 0,0 1 0 0 0,0-1 0 0 0,0 0 1 0 0,0 0-1 0 0,0 1 0 0 0,-1-1 0 0 0,-7 10 280 0 0,-13 5-170 0 0,0 0 0 0 0,-41 20 0 0 0,23-14-50 0 0,-84 41 68 0 0,76-40-8 0 0,-83 52 0 0 0,25-9 98 0 0,104-64-309 0 0,18 1-230 0 0,406-112-4730 0 0,-419 109 5052 0 0,10-3 116 0 0,0 1 1 0 0,0 1 0 0 0,0 0 0 0 0,16 0 0 0 0,-66 14 447 0 0,-1-7-283 0 0,28-4 26 0 0,1 0 1 0 0,-1 1 0 0 0,0 0-1 0 0,0 0 1 0 0,1 1 0 0 0,-17 7-1 0 0,23-8-276 0 0,-1-1 1 0 0,1 1-1 0 0,0 0 0 0 0,0-1 0 0 0,0 1 0 0 0,0 0 0 0 0,1 0 1 0 0,-1 0-1 0 0,0 1 0 0 0,1-1 0 0 0,-1 0 0 0 0,1 0 0 0 0,0 1 0 0 0,0-1 1 0 0,0 1-1 0 0,0-1 0 0 0,0 1 0 0 0,0 3 0 0 0,-1 4-42 0 0,1 0 1 0 0,0 0-1 0 0,1 14 0 0 0,0-5-4 0 0,2 21-370 0 0,0 1 0 0 0,3-1 0 0 0,17 69 0 0 0,4 30-1135 0 0,-19-90 1270 0 0,7 91-337 0 0,-14-123 630 0 0,0-1-1 0 0,-1 1 0 0 0,-1-1 1 0 0,0 0-1 0 0,-1 1 0 0 0,-8 21 1 0 0,11-37 78 0 0,-1 1 1 0 0,1-1-1 0 0,-1 0 1 0 0,1 1-1 0 0,-1-1 1 0 0,0 0 0 0 0,0 0-1 0 0,1 0 1 0 0,-1 0-1 0 0,0 0 1 0 0,0 0-1 0 0,0 0 1 0 0,0 0-1 0 0,0 0 1 0 0,0 0-1 0 0,0 0 1 0 0,0 0 0 0 0,-1-1-1 0 0,1 1 1 0 0,0-1-1 0 0,0 1 1 0 0,-1-1-1 0 0,1 1 1 0 0,0-1-1 0 0,-1 0 1 0 0,1 1-1 0 0,0-1 1 0 0,-1 0-1 0 0,1 0 1 0 0,-1 0 0 0 0,1 0-1 0 0,0 0 1 0 0,-3-1-1 0 0,-2 0 178 0 0,0-1 0 0 0,0 0 0 0 0,0 0 0 0 0,1-1 0 0 0,-10-4 0 0 0,11 4-309 0 0,-56-29-1973 0 0</inkml:trace>
+</inkml:ink>
 </file>
 
 <file path=word/theme/theme1.xml><?xml version="1.0" encoding="utf-8"?>

</xml_diff>